<commit_message>
perf: production-grade pre-deployment optimizations, lazy route splitting, R3F throttling, and SEO schemas
</commit_message>
<xml_diff>
--- a/datasource/Vivek Portfolio.docx
+++ b/datasource/Vivek Portfolio.docx
@@ -1409,7 +1409,7 @@
           <w:noProof/>
           <w:kern w:val="0"/>
         </w:rPr>
-        <w:pict w14:anchorId="45109067">
+        <w:pict w14:anchorId="558CA8DC">
           <v:rect id="_x0000_i1041" alt="" style="width:468pt;height:.05pt;mso-width-percent:0;mso-height-percent:0;mso-width-percent:0;mso-height-percent:0" o:hralign="center" o:hrstd="t" o:hr="t" fillcolor="#a0a0a0" stroked="f"/>
         </w:pict>
       </w:r>
@@ -1745,7 +1745,7 @@
           <w:kern w:val="0"/>
         </w:rPr>
         <w:lastRenderedPageBreak/>
-        <w:pict w14:anchorId="024DB0F7">
+        <w:pict w14:anchorId="43D0A46E">
           <v:rect id="_x0000_i1040" alt="" style="width:468pt;height:.05pt;mso-width-percent:0;mso-height-percent:0;mso-width-percent:0;mso-height-percent:0" o:hralign="center" o:hrstd="t" o:hr="t" fillcolor="#a0a0a0" stroked="f"/>
         </w:pict>
       </w:r>
@@ -2469,7 +2469,7 @@
           <w:noProof/>
           <w:kern w:val="0"/>
         </w:rPr>
-        <w:pict w14:anchorId="4CAD3432">
+        <w:pict w14:anchorId="57DF0A71">
           <v:rect id="_x0000_i1039" alt="" style="width:468pt;height:.05pt;mso-width-percent:0;mso-height-percent:0;mso-width-percent:0;mso-height-percent:0" o:hralign="center" o:hrstd="t" o:hr="t" fillcolor="#a0a0a0" stroked="f"/>
         </w:pict>
       </w:r>
@@ -3020,7 +3020,7 @@
           <w:noProof/>
           <w:kern w:val="0"/>
         </w:rPr>
-        <w:pict w14:anchorId="12BE89C5">
+        <w:pict w14:anchorId="232BD730">
           <v:rect id="_x0000_i1038" alt="" style="width:468pt;height:.05pt;mso-width-percent:0;mso-height-percent:0;mso-width-percent:0;mso-height-percent:0" o:hralign="center" o:hrstd="t" o:hr="t" fillcolor="#a0a0a0" stroked="f"/>
         </w:pict>
       </w:r>
@@ -3573,7 +3573,7 @@
           <w:noProof/>
           <w:kern w:val="0"/>
         </w:rPr>
-        <w:pict w14:anchorId="4C9C9C00">
+        <w:pict w14:anchorId="5716DC61">
           <v:rect id="_x0000_i1037" alt="" style="width:468pt;height:.05pt;mso-width-percent:0;mso-height-percent:0;mso-width-percent:0;mso-height-percent:0" o:hralign="center" o:hrstd="t" o:hr="t" fillcolor="#a0a0a0" stroked="f"/>
         </w:pict>
       </w:r>
@@ -4134,7 +4134,7 @@
           <w:noProof/>
           <w:kern w:val="0"/>
         </w:rPr>
-        <w:pict w14:anchorId="0C5C2384">
+        <w:pict w14:anchorId="033D102B">
           <v:rect id="_x0000_i1036" style="width:0;height:1.5pt" o:hralign="center" o:hrstd="t" o:hr="t" fillcolor="#a0a0a0" stroked="f"/>
         </w:pict>
       </w:r>
@@ -4714,7 +4714,7 @@
           <w:noProof/>
           <w:kern w:val="0"/>
         </w:rPr>
-        <w:pict w14:anchorId="1FA32950">
+        <w:pict w14:anchorId="2EE43435">
           <v:rect id="_x0000_i1035" style="width:0;height:1.5pt" o:hralign="center" o:hrstd="t" o:hr="t" fillcolor="#a0a0a0" stroked="f"/>
         </w:pict>
       </w:r>
@@ -5323,7 +5323,7 @@
           <w:noProof/>
         </w:rPr>
         <w:lastRenderedPageBreak/>
-        <w:pict w14:anchorId="31E91E67">
+        <w:pict w14:anchorId="05C15455">
           <v:rect id="_x0000_i1034" alt="" style="width:468pt;height:.05pt;mso-width-percent:0;mso-height-percent:0;mso-width-percent:0;mso-height-percent:0" o:hralign="center" o:hrstd="t" o:hr="t" fillcolor="#a0a0a0" stroked="f"/>
         </w:pict>
       </w:r>
@@ -5387,7 +5387,7 @@
         <w:rPr>
           <w:noProof/>
         </w:rPr>
-        <w:pict w14:anchorId="46E444C2">
+        <w:pict w14:anchorId="520C70A8">
           <v:rect id="_x0000_i1033" alt="" style="width:468pt;height:.05pt;mso-width-percent:0;mso-height-percent:0;mso-width-percent:0;mso-height-percent:0" o:hralign="center" o:hrstd="t" o:hr="t" fillcolor="#a0a0a0" stroked="f"/>
         </w:pict>
       </w:r>
@@ -5443,7 +5443,7 @@
         <w:rPr>
           <w:noProof/>
         </w:rPr>
-        <w:pict w14:anchorId="5338B555">
+        <w:pict w14:anchorId="66BCC162">
           <v:rect id="_x0000_i1032" alt="" style="width:468pt;height:.05pt;mso-width-percent:0;mso-height-percent:0;mso-width-percent:0;mso-height-percent:0" o:hralign="center" o:hrstd="t" o:hr="t" fillcolor="#a0a0a0" stroked="f"/>
         </w:pict>
       </w:r>
@@ -5508,7 +5508,7 @@
         <w:rPr>
           <w:noProof/>
         </w:rPr>
-        <w:pict w14:anchorId="5DB1C74A">
+        <w:pict w14:anchorId="1E9FDB4F">
           <v:rect id="_x0000_i1031" alt="" style="width:468pt;height:.05pt;mso-width-percent:0;mso-height-percent:0;mso-width-percent:0;mso-height-percent:0" o:hralign="center" o:hrstd="t" o:hr="t" fillcolor="#a0a0a0" stroked="f"/>
         </w:pict>
       </w:r>
@@ -5572,7 +5572,7 @@
         <w:rPr>
           <w:noProof/>
         </w:rPr>
-        <w:pict w14:anchorId="7414EBF2">
+        <w:pict w14:anchorId="5E190CB2">
           <v:rect id="_x0000_i1030" alt="" style="width:468pt;height:.05pt;mso-width-percent:0;mso-height-percent:0;mso-width-percent:0;mso-height-percent:0" o:hralign="center" o:hrstd="t" o:hr="t" fillcolor="#a0a0a0" stroked="f"/>
         </w:pict>
       </w:r>
@@ -5636,7 +5636,7 @@
         <w:rPr>
           <w:noProof/>
         </w:rPr>
-        <w:pict w14:anchorId="22C33A7F">
+        <w:pict w14:anchorId="74F17155">
           <v:rect id="_x0000_i1029" alt="" style="width:468pt;height:.05pt;mso-width-percent:0;mso-height-percent:0;mso-width-percent:0;mso-height-percent:0" o:hralign="center" o:hrstd="t" o:hr="t" fillcolor="#a0a0a0" stroked="f"/>
         </w:pict>
       </w:r>
@@ -5690,7 +5690,7 @@
         <w:rPr>
           <w:noProof/>
         </w:rPr>
-        <w:pict w14:anchorId="50287120">
+        <w:pict w14:anchorId="5C309EF4">
           <v:rect id="_x0000_i1028" alt="" style="width:468pt;height:.05pt;mso-width-percent:0;mso-height-percent:0;mso-width-percent:0;mso-height-percent:0" o:hralign="center" o:hrstd="t" o:hr="t" fillcolor="#a0a0a0" stroked="f"/>
         </w:pict>
       </w:r>
@@ -5848,7 +5848,7 @@
         <w:rPr>
           <w:noProof/>
         </w:rPr>
-        <w:pict w14:anchorId="611FF3D7">
+        <w:pict w14:anchorId="61C32557">
           <v:rect id="_x0000_i1027" alt="" style="width:468pt;height:.05pt;mso-width-percent:0;mso-height-percent:0;mso-width-percent:0;mso-height-percent:0" o:hralign="center" o:hrstd="t" o:hr="t" fillcolor="#a0a0a0" stroked="f"/>
         </w:pict>
       </w:r>
@@ -6007,7 +6007,7 @@
         <w:rPr>
           <w:noProof/>
         </w:rPr>
-        <w:pict w14:anchorId="5D563AC2">
+        <w:pict w14:anchorId="0F9ABC0C">
           <v:rect id="_x0000_i1026" style="width:0;height:1.5pt" o:hralign="center" o:hrstd="t" o:hr="t" fillcolor="#a0a0a0" stroked="f"/>
         </w:pict>
       </w:r>
@@ -6142,7 +6142,7 @@
         <w:rPr>
           <w:noProof/>
         </w:rPr>
-        <w:pict w14:anchorId="5560E715">
+        <w:pict w14:anchorId="61DCD6D7">
           <v:rect id="_x0000_i1025" style="width:0;height:1.5pt" o:hralign="center" o:hrstd="t" o:hr="t" fillcolor="#a0a0a0" stroked="f"/>
         </w:pict>
       </w:r>
@@ -6320,6 +6320,7 @@
         <w:br/>
       </w:r>
     </w:p>
+    <w:p/>
     <w:p/>
     <w:sectPr>
       <w:pgSz w:w="12240" w:h="15840"/>

</xml_diff>